<commit_message>
Deploy preview for PR 677 🛫
</commit_message>
<xml_diff>
--- a/pr-preview/pr-677/vignettes/articles/version-crosswalk-1.3-to-1.4.docx
+++ b/pr-preview/pr-677/vignettes/articles/version-crosswalk-1.3-to-1.4.docx
@@ -3049,7 +3049,7 @@
         <w:rPr>
           <w:rStyle w:val="CommentTok"/>
         </w:rPr>
-        <w:t xml:space="preserve">#&gt;     age id    antigen_iso     value</w:t>
+        <w:t xml:space="preserve">#&gt;     age id    antigen_iso value</w:t>
       </w:r>
       <w:r>
         <w:br/>
@@ -3058,7 +3058,7 @@
         <w:rPr>
           <w:rStyle w:val="CommentTok"/>
         </w:rPr>
-        <w:t xml:space="preserve">#&gt;   &lt;dbl&gt; &lt;chr&gt; &lt;chr&gt;           &lt;dbl&gt;</w:t>
+        <w:t xml:space="preserve">#&gt;   &lt;dbl&gt; &lt;chr&gt; &lt;chr&gt;       &lt;dbl&gt;</w:t>
       </w:r>
       <w:r>
         <w:br/>
@@ -3067,7 +3067,7 @@
         <w:rPr>
           <w:rStyle w:val="CommentTok"/>
         </w:rPr>
-        <w:t xml:space="preserve">#&gt; 1  4.91 1     HlyE_IgA        0.635</w:t>
+        <w:t xml:space="preserve">#&gt; 1 19.9  1     HlyE_IgA    1.61 </w:t>
       </w:r>
       <w:r>
         <w:br/>
@@ -3076,7 +3076,7 @@
         <w:rPr>
           <w:rStyle w:val="CommentTok"/>
         </w:rPr>
-        <w:t xml:space="preserve">#&gt; 2  4.91 1     HlyE_IgG        0.539</w:t>
+        <w:t xml:space="preserve">#&gt; 2 19.9  1     HlyE_IgG    1.29 </w:t>
       </w:r>
       <w:r>
         <w:br/>
@@ -3085,7 +3085,7 @@
         <w:rPr>
           <w:rStyle w:val="CommentTok"/>
         </w:rPr>
-        <w:t xml:space="preserve">#&gt; 3  1.58 2     HlyE_IgA       97.6  </w:t>
+        <w:t xml:space="preserve">#&gt; 3  0.16 2     HlyE_IgA    0.522</w:t>
       </w:r>
       <w:r>
         <w:br/>
@@ -3094,7 +3094,7 @@
         <w:rPr>
           <w:rStyle w:val="CommentTok"/>
         </w:rPr>
-        <w:t xml:space="preserve">#&gt; 4  1.58 2     HlyE_IgG     8795.   </w:t>
+        <w:t xml:space="preserve">#&gt; 4  0.16 2     HlyE_IgG    0.461</w:t>
       </w:r>
       <w:r>
         <w:br/>
@@ -3103,7 +3103,7 @@
         <w:rPr>
           <w:rStyle w:val="CommentTok"/>
         </w:rPr>
-        <w:t xml:space="preserve">#&gt; 5  4.3  3     HlyE_IgA      637.   </w:t>
+        <w:t xml:space="preserve">#&gt; 5  9.02 3     HlyE_IgA    0.162</w:t>
       </w:r>
       <w:r>
         <w:br/>
@@ -3112,7 +3112,7 @@
         <w:rPr>
           <w:rStyle w:val="CommentTok"/>
         </w:rPr>
-        <w:t xml:space="preserve">#&gt; 6  4.3  3     HlyE_IgG    73811.</w:t>
+        <w:t xml:space="preserve">#&gt; 6  9.02 3     HlyE_IgG    0.350</w:t>
       </w:r>
       <w:r>
         <w:br/>

</xml_diff>